<commit_message>
Commit known good files
</commit_message>
<xml_diff>
--- a/CANONICAL - Chris Tallent Resume - CTO.docx
+++ b/CANONICAL - Chris Tallent Resume - CTO.docx
@@ -4,9 +4,15 @@
   <w:body>
     <w:p>
       <w:pPr>
-        <w:keepNext/>
-        <w:keepLines/>
-        <w:spacing w:before="120" w:after="40"/>
+        <w:pStyle w:val="Heading1"/>
+      </w:pPr>
+      <w:r>
+        <w:t>CHRIS TALLENT</w:t>
+      </w:r>
+    </w:p>
+    <w:p>
+      <w:pPr>
+        <w:spacing w:before="40" w:after="40"/>
         <w:jc w:val="center"/>
         <w:rPr>
           <w:sz w:val="21"/>
@@ -18,43 +24,25 @@
           <w:sz w:val="21"/>
           <w:szCs w:val="21"/>
         </w:rPr>
-        <w:t xml:space="preserve"> </w:t>
+        <w:t>Chief Technology Officer | Cloud &amp; AI Product Leader | Technical Founder</w:t>
       </w:r>
-      <w:r>
+    </w:p>
+    <w:p>
+      <w:pPr>
+        <w:spacing w:before="40" w:after="40"/>
+        <w:jc w:val="center"/>
         <w:rPr>
-          <w:b/>
-          <w:bCs/>
-          <w:color w:val="17365D" w:themeColor="text2" w:themeShade="BF"/>
-          <w:sz w:val="26"/>
-          <w:szCs w:val="26"/>
+          <w:sz w:val="21"/>
+          <w:szCs w:val="21"/>
         </w:rPr>
-        <w:t>CHRIS TALLENT</w:t>
-      </w:r>
+      </w:pPr>
       <w:r>
         <w:rPr>
           <w:sz w:val="21"/>
           <w:szCs w:val="21"/>
         </w:rPr>
-        <w:br/>
-        <w:t xml:space="preserve">Chief Technology Officer | Cloud &amp; AI Product Leader | Technical Founder </w:t>
+        <w:t>Cincinnati Metro Area • 859.394.2923 • chris@provenedge.com • linkedin.com/in/tallented</w:t>
       </w:r>
-      <w:r>
-        <w:rPr>
-          <w:sz w:val="21"/>
-          <w:szCs w:val="21"/>
-        </w:rPr>
-        <w:br/>
-        <w:t>Cincinnati Metro Area • 859.394.2923 • chris@provenedge.com • linkedin.com/in/</w:t>
-      </w:r>
-      <w:proofErr w:type="spellStart"/>
-      <w:r>
-        <w:rPr>
-          <w:sz w:val="21"/>
-          <w:szCs w:val="21"/>
-        </w:rPr>
-        <w:t>tallented</w:t>
-      </w:r>
-      <w:proofErr w:type="spellEnd"/>
     </w:p>
     <w:p>
       <w:pPr>
@@ -89,15 +77,9 @@
     </w:p>
     <w:p>
       <w:pPr>
-        <w:keepNext/>
-        <w:keepLines/>
-        <w:spacing w:before="320" w:after="80"/>
+        <w:pStyle w:val="Heading2"/>
       </w:pPr>
       <w:r>
-        <w:rPr>
-          <w:b/>
-          <w:color w:val="00467F"/>
-        </w:rPr>
         <w:t>PROFESSIONAL SUMMARY</w:t>
       </w:r>
     </w:p>
@@ -116,20 +98,14 @@
           <w:sz w:val="21"/>
           <w:szCs w:val="21"/>
         </w:rPr>
-        <w:t>Technology executive with 20+ years of experience leading full-stack software engineering, SaaS platform architecture, and AI-driven product innovation. Proven record scaling startup engineering organizations, modernizing legacy systems, and delivering enterprise-grade cloud solutions on AWS, Java, and modern JavaScript frameworks. Hands-on technology leader with a track record of setting technical direction, improving delivery, and leading security and compliance work across cloud-native and regulated systems.</w:t>
+        <w:t>Technology executive with 20+ years of experience leading full-stack software engineering, SaaS platform architecture, and AI-driven product innovation. Proven record scaling startup engineering organizations, modernizing legacy systems, and delivering enterprise-grade cloud solutions on AWS, Java, and modern JavaScript frameworks. Hands-on technology leader with a track record of setting technical direction, improving delivery, and leading security and compliance work across cloud-native platforms, regulated data, enterprise risk reviews, and ISO 27001 audit readiness.</w:t>
       </w:r>
     </w:p>
     <w:p>
       <w:pPr>
-        <w:keepNext/>
-        <w:keepLines/>
-        <w:spacing w:before="320" w:after="80"/>
+        <w:pStyle w:val="Heading2"/>
       </w:pPr>
       <w:r>
-        <w:rPr>
-          <w:b/>
-          <w:color w:val="00467F"/>
-        </w:rPr>
         <w:t>CORE SKILLS</w:t>
       </w:r>
     </w:p>
@@ -147,298 +123,51 @@
           <w:sz w:val="21"/>
           <w:szCs w:val="21"/>
         </w:rPr>
-        <w:t>Leadership: Fractional &amp; Startup CTO • Team Building • Agile Delivery • DevOps Strategy • ISO 27001</w:t>
-      </w:r>
-      <w:r>
-        <w:rPr>
-          <w:sz w:val="21"/>
-          <w:szCs w:val="21"/>
-        </w:rPr>
-        <w:t xml:space="preserve"> </w:t>
-      </w:r>
-      <w:r>
-        <w:rPr>
-          <w:sz w:val="21"/>
-          <w:szCs w:val="21"/>
-        </w:rPr>
-        <w:t>Complian</w:t>
-      </w:r>
-      <w:r>
-        <w:rPr>
-          <w:sz w:val="21"/>
-          <w:szCs w:val="21"/>
-        </w:rPr>
-        <w:t>ce</w:t>
-      </w:r>
-      <w:r>
-        <w:rPr>
-          <w:sz w:val="21"/>
-          <w:szCs w:val="21"/>
-        </w:rPr>
+        <w:t>Leadership: CTO Leadership • Product &amp; Platform Strategy • Team Building • Agile Delivery • Executive Alignment</w:t>
         <w:br/>
-        <w:t xml:space="preserve">Technical: </w:t>
-      </w:r>
-      <w:r>
-        <w:rPr>
-          <w:sz w:val="21"/>
-          <w:szCs w:val="21"/>
-        </w:rPr>
-        <w:t>Java / Spring Framework</w:t>
-      </w:r>
-      <w:r>
-        <w:rPr>
-          <w:sz w:val="21"/>
-          <w:szCs w:val="21"/>
-        </w:rPr>
-        <w:t xml:space="preserve"> • Python</w:t>
-      </w:r>
-      <w:r>
-        <w:rPr>
-          <w:sz w:val="21"/>
-          <w:szCs w:val="21"/>
-        </w:rPr>
-        <w:t xml:space="preserve"> • TypeScript / JavaScript (Vue.js, React, Angular, Next.js, Node.js</w:t>
-      </w:r>
-      <w:r>
-        <w:rPr>
-          <w:sz w:val="21"/>
-          <w:szCs w:val="21"/>
-        </w:rPr>
-        <w:t>)</w:t>
-      </w:r>
-      <w:r>
-        <w:rPr>
-          <w:sz w:val="21"/>
-          <w:szCs w:val="21"/>
-        </w:rPr>
+        <w:t>Enterprise Delivery: Roadmap Sequencing • Stakeholder Management • Release Cadence • Risk Reviews</w:t>
         <w:br/>
-        <w:t>Cloud &amp; Data: AWS (</w:t>
-      </w:r>
-      <w:r>
-        <w:rPr>
-          <w:sz w:val="21"/>
-          <w:szCs w:val="21"/>
-        </w:rPr>
-        <w:t xml:space="preserve">ECS, </w:t>
-      </w:r>
-      <w:r>
-        <w:rPr>
-          <w:sz w:val="21"/>
-          <w:szCs w:val="21"/>
-        </w:rPr>
-        <w:t xml:space="preserve">Lambda, Bedrock, </w:t>
-      </w:r>
-      <w:proofErr w:type="spellStart"/>
-      <w:r>
-        <w:rPr>
-          <w:sz w:val="21"/>
-          <w:szCs w:val="21"/>
-        </w:rPr>
-        <w:t>Textract</w:t>
-      </w:r>
-      <w:proofErr w:type="spellEnd"/>
-      <w:r>
-        <w:rPr>
-          <w:sz w:val="21"/>
-          <w:szCs w:val="21"/>
-        </w:rPr>
-        <w:t xml:space="preserve">, RDS, </w:t>
-      </w:r>
-      <w:r>
-        <w:rPr>
-          <w:sz w:val="21"/>
-          <w:szCs w:val="21"/>
-        </w:rPr>
-        <w:t>S3</w:t>
-      </w:r>
-      <w:r>
-        <w:rPr>
-          <w:sz w:val="21"/>
-          <w:szCs w:val="21"/>
-        </w:rPr>
-        <w:t>, Kubernetes</w:t>
-      </w:r>
-      <w:r>
-        <w:rPr>
-          <w:sz w:val="21"/>
-          <w:szCs w:val="21"/>
-        </w:rPr>
-        <w:t>) • PostgreSQL</w:t>
-      </w:r>
-      <w:r>
-        <w:rPr>
-          <w:sz w:val="21"/>
-          <w:szCs w:val="21"/>
-        </w:rPr>
-        <w:t xml:space="preserve"> • MySQL</w:t>
-      </w:r>
-      <w:r>
-        <w:rPr>
-          <w:sz w:val="21"/>
-          <w:szCs w:val="21"/>
-        </w:rPr>
-        <w:t xml:space="preserve"> • MongoDB</w:t>
-      </w:r>
-      <w:r>
-        <w:rPr>
-          <w:sz w:val="21"/>
-          <w:szCs w:val="21"/>
-        </w:rPr>
-        <w:t xml:space="preserve"> </w:t>
-      </w:r>
-      <w:r>
-        <w:rPr>
-          <w:sz w:val="21"/>
-          <w:szCs w:val="21"/>
-        </w:rPr>
+        <w:t>Cloud &amp; Security: AWS • ISO 27001 • RBAC / IAM • Pen Testing • Vulnerability Remediation</w:t>
         <w:br/>
-        <w:t>AI &amp; Automation: Retrieval-Augmented Generation (RAG) • Claude / Bedrock Integration • NLP Applications</w:t>
-      </w:r>
-      <w:r>
-        <w:rPr>
-          <w:sz w:val="21"/>
-          <w:szCs w:val="21"/>
-        </w:rPr>
+        <w:t>AI &amp; Modernization: RAG • Bedrock / Textract • Claude Code • AI-Assisted Modernization • Document Extraction</w:t>
         <w:br/>
-        <w:t xml:space="preserve">Tools: Docker </w:t>
-      </w:r>
-      <w:r>
-        <w:rPr>
-          <w:sz w:val="21"/>
-          <w:szCs w:val="21"/>
-        </w:rPr>
-        <w:t xml:space="preserve">/ </w:t>
-      </w:r>
-      <w:proofErr w:type="spellStart"/>
-      <w:r>
-        <w:rPr>
-          <w:sz w:val="21"/>
-          <w:szCs w:val="21"/>
-        </w:rPr>
-        <w:t>Pulumi</w:t>
-      </w:r>
-      <w:proofErr w:type="spellEnd"/>
-      <w:r>
-        <w:rPr>
-          <w:sz w:val="21"/>
-          <w:szCs w:val="21"/>
-        </w:rPr>
-        <w:t xml:space="preserve"> </w:t>
-      </w:r>
-      <w:r>
-        <w:rPr>
-          <w:sz w:val="21"/>
-          <w:szCs w:val="21"/>
-        </w:rPr>
-        <w:t xml:space="preserve">• </w:t>
-      </w:r>
-      <w:r>
-        <w:rPr>
-          <w:sz w:val="21"/>
-          <w:szCs w:val="21"/>
-        </w:rPr>
-        <w:t xml:space="preserve">GitHub Actions / </w:t>
-      </w:r>
-      <w:r>
-        <w:rPr>
-          <w:sz w:val="21"/>
-          <w:szCs w:val="21"/>
-        </w:rPr>
-        <w:t>Bitbucket Pipelines</w:t>
-      </w:r>
-      <w:r>
-        <w:rPr>
-          <w:sz w:val="21"/>
-          <w:szCs w:val="21"/>
-        </w:rPr>
-        <w:t xml:space="preserve"> • SonarQube </w:t>
-      </w:r>
-      <w:r>
-        <w:rPr>
-          <w:sz w:val="21"/>
-          <w:szCs w:val="21"/>
-        </w:rPr>
-        <w:t xml:space="preserve">• </w:t>
-      </w:r>
-      <w:r>
-        <w:rPr>
-          <w:sz w:val="21"/>
-          <w:szCs w:val="21"/>
-        </w:rPr>
-        <w:t>New Relic • CloudWatch</w:t>
+        <w:t>Engineering: Java / Spring • Python • TypeScript / JavaScript • APIs • PostgreSQL</w:t>
       </w:r>
     </w:p>
     <w:p>
       <w:pPr>
-        <w:keepNext/>
-        <w:keepLines/>
-        <w:spacing w:before="320" w:after="80"/>
+        <w:pStyle w:val="Heading2"/>
       </w:pPr>
       <w:r>
-        <w:rPr>
-          <w:b/>
-          <w:color w:val="00467F"/>
-        </w:rPr>
         <w:t>PROFESSIONAL EXPERIENCE</w:t>
       </w:r>
     </w:p>
     <w:p>
       <w:pPr>
-        <w:keepNext/>
-        <w:keepLines/>
-        <w:spacing w:before="120" w:after="40"/>
+        <w:pStyle w:val="Heading3"/>
+      </w:pPr>
+      <w:r>
+        <w:t>Chief Technology Officer | Pitchstone Technology LLC</w:t>
+      </w:r>
+    </w:p>
+    <w:p>
+      <w:pPr>
+        <w:spacing w:before="20" w:after="40"/>
         <w:rPr>
+          <w:i/>
+          <w:iCs/>
           <w:sz w:val="21"/>
           <w:szCs w:val="21"/>
         </w:rPr>
       </w:pPr>
       <w:r>
         <w:rPr>
-          <w:b/>
+          <w:i/>
+          <w:iCs/>
           <w:sz w:val="21"/>
           <w:szCs w:val="21"/>
         </w:rPr>
-        <w:t>Chief Technology Officer | Pitchstone Technology LLC</w:t>
-      </w:r>
-      <w:r>
-        <w:rPr>
-          <w:i/>
-          <w:sz w:val="21"/>
-          <w:szCs w:val="21"/>
-        </w:rPr>
-        <w:br/>
-      </w:r>
-      <w:r>
-        <w:rPr>
-          <w:i/>
-          <w:sz w:val="21"/>
-          <w:szCs w:val="21"/>
-        </w:rPr>
-        <w:t>Seattle, WA</w:t>
-      </w:r>
-      <w:r>
-        <w:rPr>
-          <w:i/>
-          <w:sz w:val="21"/>
-          <w:szCs w:val="21"/>
-        </w:rPr>
-        <w:t xml:space="preserve"> • </w:t>
-      </w:r>
-      <w:r>
-        <w:rPr>
-          <w:i/>
-          <w:sz w:val="21"/>
-          <w:szCs w:val="21"/>
-        </w:rPr>
-        <w:t>February</w:t>
-      </w:r>
-      <w:r>
-        <w:rPr>
-          <w:i/>
-          <w:sz w:val="21"/>
-          <w:szCs w:val="21"/>
-        </w:rPr>
-        <w:t xml:space="preserve"> 2021 – Present</w:t>
+        <w:t>Seattle, WA • February 2021 – Present</w:t>
       </w:r>
     </w:p>
     <w:p>
@@ -460,7 +189,7 @@
           <w:sz w:val="21"/>
           <w:szCs w:val="21"/>
         </w:rPr>
-        <w:t>Set technology strategy for an AI-enabled real-estate platform supporting a Fortune 100 wireless retailer's store-development workflow across roughly 15,000 locations, with responsibility for product architecture, delivery process, release cadence, DevOps, and security compliance.</w:t>
+        <w:t>Set product and technology direction for an AI-enabled real-estate platform supporting a Fortune 100 wireless retailer's store-development process across roughly 15,000 locations, translating enterprise requirements into architecture, delivery sequencing, release cadence, DevOps, ISO 27001 controls, and security-review readiness.</w:t>
       </w:r>
     </w:p>
     <w:p>
@@ -478,7 +207,7 @@
           <w:sz w:val="21"/>
           <w:szCs w:val="21"/>
         </w:rPr>
-        <w:t>Served as product owner and lead architect for Pitchstone Platform, defining the configuration-driven model for entities, fields, and platform behavior while bootstrapping the first version and guiding architecture, cloud/security design, and technical standards as implementation transitioned to the engineering teams.</w:t>
+        <w:t>Served as product owner and lead architect for Pitchstone Platform, translating enterprise requirements into configuration-driven entities, fields, platform behavior, APIs, authentication, RBAC, and engineering standards.</w:t>
       </w:r>
     </w:p>
     <w:p>
@@ -496,7 +225,7 @@
           <w:sz w:val="21"/>
           <w:szCs w:val="21"/>
         </w:rPr>
-        <w:t>Built out engineering from a small initial team into a four-team organization, raising morale from 2/5 to 5/5 and improving retention.</w:t>
+        <w:t>Built engineering into a four-team organization with a development manager reporting to the CTO and embedded product owners, raising morale from 2/5 to 5/5 while improving retention and developer ownership.</w:t>
       </w:r>
     </w:p>
     <w:p>
@@ -509,16 +238,14 @@
           <w:szCs w:val="21"/>
         </w:rPr>
       </w:pPr>
-      <w:bookmarkStart w:id="0" w:name="OLE_LINK1"/>
       <w:r>
         <w:rPr>
           <w:sz w:val="21"/>
           <w:szCs w:val="21"/>
         </w:rPr>
-        <w:t>Built and delivered MVP platform on TypeScript, Vue.js, Java, Spring Framework, and PostgreSQL, designing scalable APIs and mentoring the engineering team through early release cycles.</w:t>
+        <w:t>Led the first Pitchstone Platform release from enterprise requirements to production-ready delivery on TypeScript, Vue.js, Java, Spring Framework, and PostgreSQL, pairing scalable APIs with team mentoring.</w:t>
       </w:r>
     </w:p>
-    <w:bookmarkEnd w:id="0"/>
     <w:p>
       <w:pPr>
         <w:pStyle w:val="ListBullet"/>
@@ -552,25 +279,7 @@
           <w:sz w:val="21"/>
           <w:szCs w:val="21"/>
         </w:rPr>
-        <w:t>Partnered with product, IT, cybersecurity, and management stakeholders for a Fortune 100 wireless retailer on roadmap priorities, APIs, technical risk, and cross-team workflow coordination.</w:t>
-      </w:r>
-    </w:p>
-    <w:p>
-      <w:pPr>
-        <w:pStyle w:val="ListBullet"/>
-        <w:keepLines/>
-        <w:spacing w:after="40" w:line="271" w:lineRule="auto"/>
-        <w:rPr>
-          <w:sz w:val="21"/>
-          <w:szCs w:val="21"/>
-        </w:rPr>
-      </w:pPr>
-      <w:r>
-        <w:rPr>
-          <w:sz w:val="21"/>
-          <w:szCs w:val="21"/>
-        </w:rPr>
-        <w:t>Spearheaded AI-driven code modernization with Claude Code, automating library upgrades, generating tests, and using AI-assisted workflows for modernization planning, cutting delivery time from 4 months to 3 weeks.</w:t>
+        <w:t>Spearheaded AI-driven code modernization with Claude Code, automating library upgrades, generating tests, and structuring modernization plans for legacy services, cutting delivery time from 4 months to 3 weeks.</w:t>
       </w:r>
     </w:p>
     <w:p>
@@ -620,7 +329,7 @@
           <w:sz w:val="21"/>
           <w:szCs w:val="21"/>
         </w:rPr>
-        <w:t>Defined AWS account structure, RBAC, IAM Identity Center permission sets, and access boundaries across five AWS accounts supporting both TBuilder and Pitchstone Platform.</w:t>
+        <w:t>Designed cloud security foundations across five AWS accounts, including RBAC, IAM Identity Center, Microsoft Entra SSO, Keycloak OIDC, AWS Secrets Manager, signed Docker images, and access controls.</w:t>
       </w:r>
     </w:p>
     <w:p>
@@ -638,68 +347,35 @@
           <w:sz w:val="21"/>
           <w:szCs w:val="21"/>
         </w:rPr>
-        <w:t>Directed ISO 27001 security compliance, overseeing penetration testing, audits, and vulnerability remediation.</w:t>
+        <w:t>Led ISO 27001 compliance, penetration testing, audit preparation, vulnerability remediation, T-Mobile risk assessments, and transition documentation, including runbooks, diagrams, policies, and least-privilege controls.</w:t>
       </w:r>
     </w:p>
     <w:p>
       <w:pPr>
-        <w:keepNext/>
-        <w:keepLines/>
-        <w:spacing w:before="340" w:after="40"/>
+        <w:pStyle w:val="Heading3"/>
+      </w:pPr>
+      <w:r>
+        <w:t>Chief Technology Officer | Automobile Consumer Services Inc</w:t>
+      </w:r>
+    </w:p>
+    <w:p>
+      <w:pPr>
+        <w:spacing w:before="20" w:after="40"/>
         <w:rPr>
+          <w:i/>
+          <w:iCs/>
           <w:sz w:val="21"/>
           <w:szCs w:val="21"/>
         </w:rPr>
       </w:pPr>
       <w:r>
         <w:rPr>
-          <w:b/>
+          <w:i/>
+          <w:iCs/>
           <w:sz w:val="21"/>
           <w:szCs w:val="21"/>
         </w:rPr>
-        <w:lastRenderedPageBreak/>
-        <w:t>Chief Technology Officer | Automobile Consumer Services Inc</w:t>
-      </w:r>
-      <w:r>
-        <w:rPr>
-          <w:i/>
-          <w:sz w:val="21"/>
-          <w:szCs w:val="21"/>
-        </w:rPr>
-        <w:br/>
-        <w:t>Cincinnati, OH • Ju</w:t>
-      </w:r>
-      <w:r>
-        <w:rPr>
-          <w:i/>
-          <w:sz w:val="21"/>
-          <w:szCs w:val="21"/>
-        </w:rPr>
-        <w:t>ly</w:t>
-      </w:r>
-      <w:r>
-        <w:rPr>
-          <w:i/>
-          <w:sz w:val="21"/>
-          <w:szCs w:val="21"/>
-        </w:rPr>
-        <w:t xml:space="preserve"> 2016 – </w:t>
-      </w:r>
-      <w:r>
-        <w:rPr>
-          <w:i/>
-          <w:sz w:val="21"/>
-          <w:szCs w:val="21"/>
-        </w:rPr>
-        <w:t>February</w:t>
-      </w:r>
-      <w:r>
-        <w:rPr>
-          <w:i/>
-          <w:sz w:val="21"/>
-          <w:szCs w:val="21"/>
-        </w:rPr>
-        <w:t xml:space="preserve"> 2021</w:t>
+        <w:t>Cincinnati, OH • July 2016 – February 2021</w:t>
       </w:r>
     </w:p>
     <w:p>
@@ -721,7 +397,8 @@
           <w:sz w:val="21"/>
           <w:szCs w:val="21"/>
         </w:rPr>
-        <w:t>Led technology transformation for a fintech organization, overseeing development, cloud migration, and agile adoption while completely revamping and modernizing the technology stack and development process.</w:t>
+        <w:lastRenderedPageBreak/>
+        <w:t>Led technology transformation for an automotive fintech organization, modernizing cloud architecture, Agile delivery, release engineering, and systems handling payments, PII, Social Security numbers, and soft-credit decisioning.</w:t>
       </w:r>
     </w:p>
     <w:p>
@@ -740,6 +417,42 @@
           <w:szCs w:val="21"/>
         </w:rPr>
         <w:t>Built a new automotive fintech platform using AngularJS, Java, Spring MVC, PostgreSQL, Docker, and Kubernetes on AWS, providing a modular foundation for rapid feature rollout and improved reliability.</w:t>
+      </w:r>
+    </w:p>
+    <w:p>
+      <w:pPr>
+        <w:pStyle w:val="ListBullet"/>
+        <w:keepLines/>
+        <w:spacing w:after="40" w:line="271" w:lineRule="auto"/>
+        <w:rPr>
+          <w:sz w:val="21"/>
+          <w:szCs w:val="21"/>
+        </w:rPr>
+      </w:pPr>
+      <w:r>
+        <w:rPr>
+          <w:sz w:val="21"/>
+          <w:szCs w:val="21"/>
+        </w:rPr>
+        <w:t>Modernized systems handling PII, Social Security numbers, payment data, and soft-credit processes, embedding data protection, auditability, and reliability requirements into the architecture.</w:t>
+      </w:r>
+    </w:p>
+    <w:p>
+      <w:pPr>
+        <w:pStyle w:val="ListBullet"/>
+        <w:keepLines/>
+        <w:spacing w:after="40" w:line="271" w:lineRule="auto"/>
+        <w:rPr>
+          <w:sz w:val="21"/>
+          <w:szCs w:val="21"/>
+        </w:rPr>
+      </w:pPr>
+      <w:r>
+        <w:rPr>
+          <w:sz w:val="21"/>
+          <w:szCs w:val="21"/>
+        </w:rPr>
+        <w:t>Partnered with C-level and product stakeholders on roadmap sequencing, delivery risk, and quality tradeoffs, pushing back when urgency threatened quality, delivery discipline, or long-term maintainability.</w:t>
       </w:r>
     </w:p>
     <w:p>
@@ -833,46 +546,30 @@
     </w:p>
     <w:p>
       <w:pPr>
-        <w:keepNext/>
-        <w:keepLines/>
-        <w:spacing w:before="340" w:after="40"/>
+        <w:pStyle w:val="Heading3"/>
+      </w:pPr>
+      <w:r>
+        <w:t>Owner &amp; Fractional CTO | Proven Edge LLC</w:t>
+      </w:r>
+    </w:p>
+    <w:p>
+      <w:pPr>
+        <w:spacing w:before="20" w:after="40"/>
         <w:rPr>
+          <w:i/>
+          <w:iCs/>
           <w:sz w:val="21"/>
           <w:szCs w:val="21"/>
         </w:rPr>
       </w:pPr>
       <w:r>
         <w:rPr>
-          <w:b/>
+          <w:i/>
+          <w:iCs/>
           <w:sz w:val="21"/>
           <w:szCs w:val="21"/>
         </w:rPr>
-        <w:t>Owner &amp; Fractional CTO | Proven Edge LLC</w:t>
-      </w:r>
-      <w:r>
-        <w:rPr>
-          <w:i/>
-          <w:sz w:val="21"/>
-          <w:szCs w:val="21"/>
-        </w:rPr>
-        <w:br/>
-        <w:t xml:space="preserve">Fort Thomas, KY • </w:t>
-      </w:r>
-      <w:r>
-        <w:rPr>
-          <w:i/>
-          <w:sz w:val="21"/>
-          <w:szCs w:val="21"/>
-        </w:rPr>
-        <w:t>November</w:t>
-      </w:r>
-      <w:r>
-        <w:rPr>
-          <w:i/>
-          <w:sz w:val="21"/>
-          <w:szCs w:val="21"/>
-        </w:rPr>
-        <w:t xml:space="preserve"> 2015 – Present</w:t>
+        <w:t>Fort Thomas, KY • November 2015 – Present</w:t>
       </w:r>
     </w:p>
     <w:p>
@@ -907,7 +604,7 @@
           <w:sz w:val="21"/>
           <w:szCs w:val="21"/>
         </w:rPr>
-        <w:t>Oversaw architecture and engineering-process governance for a laboratory-testing client, restoring management confidence and ensuring platform stability during staff transition.</w:t>
+        <w:t>Oversaw architecture and engineering-process governance for a laboratory-testing client, restoring management confidence and ensuring platform stability and delivery continuity during staff transition.</w:t>
       </w:r>
     </w:p>
     <w:p>
@@ -961,75 +658,35 @@
           <w:sz w:val="21"/>
           <w:szCs w:val="21"/>
         </w:rPr>
-        <w:t>Built a controlled AI admin assistant that let administrators manage users, inspect job queues, and check system health through natural language, with confirmation-gated actions routed through existing APIs to preserve RBAC and audit logging.</w:t>
+        <w:t>Built a controlled AI admin assistant for user management, job-queue inspection, and system-health checks through natural language, with confirmation-gated API actions preserving RBAC and audit logging.</w:t>
       </w:r>
     </w:p>
     <w:p>
       <w:pPr>
-        <w:spacing w:before="340" w:after="40"/>
+        <w:pStyle w:val="Heading3"/>
+      </w:pPr>
+      <w:r>
+        <w:t>Technical Co-Founder &amp; CTO | Glamhive</w:t>
+      </w:r>
+    </w:p>
+    <w:p>
+      <w:pPr>
+        <w:spacing w:before="20" w:after="40"/>
         <w:rPr>
+          <w:i/>
+          <w:iCs/>
           <w:sz w:val="21"/>
           <w:szCs w:val="21"/>
         </w:rPr>
       </w:pPr>
       <w:r>
         <w:rPr>
-          <w:b/>
+          <w:i/>
+          <w:iCs/>
           <w:sz w:val="21"/>
           <w:szCs w:val="21"/>
         </w:rPr>
-        <w:t xml:space="preserve">Technical Co-Founder &amp; CTO | </w:t>
-      </w:r>
-      <w:proofErr w:type="spellStart"/>
-      <w:r>
-        <w:rPr>
-          <w:b/>
-          <w:sz w:val="21"/>
-          <w:szCs w:val="21"/>
-        </w:rPr>
-        <w:t>Glamhive</w:t>
-      </w:r>
-      <w:proofErr w:type="spellEnd"/>
-      <w:r>
-        <w:rPr>
-          <w:i/>
-          <w:sz w:val="21"/>
-          <w:szCs w:val="21"/>
-        </w:rPr>
-        <w:br/>
-        <w:t>Seattle, WA • Nov</w:t>
-      </w:r>
-      <w:r>
-        <w:rPr>
-          <w:i/>
-          <w:sz w:val="21"/>
-          <w:szCs w:val="21"/>
-        </w:rPr>
-        <w:t>ember</w:t>
-      </w:r>
-      <w:r>
-        <w:rPr>
-          <w:i/>
-          <w:sz w:val="21"/>
-          <w:szCs w:val="21"/>
-        </w:rPr>
-        <w:t xml:space="preserve"> 2013 – </w:t>
-      </w:r>
-      <w:r>
-        <w:rPr>
-          <w:i/>
-          <w:sz w:val="21"/>
-          <w:szCs w:val="21"/>
-        </w:rPr>
-        <w:t>November</w:t>
-      </w:r>
-      <w:r>
-        <w:rPr>
-          <w:i/>
-          <w:sz w:val="21"/>
-          <w:szCs w:val="21"/>
-        </w:rPr>
-        <w:t xml:space="preserve"> 2015</w:t>
+        <w:t>Seattle, WA • November 2013 – November 2015</w:t>
       </w:r>
     </w:p>
     <w:p>
@@ -1063,7 +720,7 @@
           <w:sz w:val="21"/>
           <w:szCs w:val="21"/>
         </w:rPr>
-        <w:t>Won Seattle Angel Conference VII in 2015, securing $205K in investment after multiple rounds of investor interviews and product demonstrations.</w:t>
+        <w:t>Won Seattle Angel Conference VII in 2015, securing $205K in investment after investor diligence.</w:t>
       </w:r>
     </w:p>
     <w:p>
@@ -1237,60 +894,30 @@
     </w:p>
     <w:p>
       <w:pPr>
-        <w:keepNext/>
-        <w:keepLines/>
-        <w:spacing w:before="340" w:after="40"/>
+        <w:pStyle w:val="Heading3"/>
+      </w:pPr>
+      <w:r>
+        <w:t>Chief Technology Officer | Lela.com</w:t>
+      </w:r>
+    </w:p>
+    <w:p>
+      <w:pPr>
+        <w:spacing w:before="20" w:after="40"/>
         <w:rPr>
+          <w:i/>
+          <w:iCs/>
           <w:sz w:val="21"/>
           <w:szCs w:val="21"/>
         </w:rPr>
       </w:pPr>
       <w:r>
         <w:rPr>
-          <w:b/>
+          <w:i/>
+          <w:iCs/>
           <w:sz w:val="21"/>
           <w:szCs w:val="21"/>
         </w:rPr>
-        <w:t>Chief Technology Officer | Lela.com</w:t>
-      </w:r>
-      <w:r>
-        <w:rPr>
-          <w:i/>
-          <w:sz w:val="21"/>
-          <w:szCs w:val="21"/>
-        </w:rPr>
-        <w:br/>
-      </w:r>
-      <w:r>
-        <w:rPr>
-          <w:sz w:val="21"/>
-          <w:szCs w:val="21"/>
-        </w:rPr>
-        <w:t>New York, NY</w:t>
-      </w:r>
-      <w:r>
-        <w:rPr>
-          <w:i/>
-          <w:sz w:val="21"/>
-          <w:szCs w:val="21"/>
-        </w:rPr>
-        <w:t xml:space="preserve"> • </w:t>
-      </w:r>
-      <w:r>
-        <w:rPr>
-          <w:i/>
-          <w:sz w:val="21"/>
-          <w:szCs w:val="21"/>
-        </w:rPr>
-        <w:t>November</w:t>
-      </w:r>
-      <w:r>
-        <w:rPr>
-          <w:i/>
-          <w:sz w:val="21"/>
-          <w:szCs w:val="21"/>
-        </w:rPr>
-        <w:t xml:space="preserve"> 2011 – May 2014</w:t>
+        <w:t>New York, NY • November 2011 – May 2014</w:t>
       </w:r>
     </w:p>
     <w:p>
@@ -1363,20 +990,32 @@
           <w:sz w:val="21"/>
           <w:szCs w:val="21"/>
         </w:rPr>
-        <w:t xml:space="preserve">Guided executive management team through product prioritization and presented roadmap to Board of Directors. </w:t>
+        <w:t xml:space="preserve">Used staged delivery and demos to rebuild post-pivot confidence across product and engineering. </w:t>
       </w:r>
     </w:p>
     <w:p>
       <w:pPr>
-        <w:keepNext/>
+        <w:pStyle w:val="ListBullet"/>
         <w:keepLines/>
-        <w:spacing w:before="320" w:after="80"/>
+        <w:spacing w:after="40" w:line="271" w:lineRule="auto"/>
+        <w:rPr>
+          <w:sz w:val="21"/>
+          <w:szCs w:val="21"/>
+        </w:rPr>
       </w:pPr>
       <w:r>
         <w:rPr>
-          <w:b/>
-          <w:color w:val="00467F"/>
+          <w:sz w:val="21"/>
+          <w:szCs w:val="21"/>
         </w:rPr>
+        <w:t xml:space="preserve">Guided executive management through post-pivot product prioritization, budget tradeoffs, and roadmap decisions, presenting technology direction to the Board of Directors and primary investor. </w:t>
+      </w:r>
+    </w:p>
+    <w:p>
+      <w:pPr>
+        <w:pStyle w:val="Heading2"/>
+      </w:pPr>
+      <w:r>
         <w:t>EDUCATION</w:t>
       </w:r>
     </w:p>
@@ -1395,43 +1034,6 @@
         </w:rPr>
         <w:t>Bachelor of Science in Computer Science, University of Kentucky, Lexington, KY</w:t>
       </w:r>
-    </w:p>
-    <w:p>
-      <w:pPr>
-        <w:keepNext/>
-        <w:keepLines/>
-        <w:spacing w:before="320" w:after="80"/>
-        <w:rPr>
-          <w:sz w:val="24"/>
-          <w:szCs w:val="24"/>
-        </w:rPr>
-      </w:pPr>
-      <w:r>
-        <w:rPr>
-          <w:b/>
-          <w:color w:val="00467F"/>
-        </w:rPr>
-        <w:t>AWARDS</w:t>
-      </w:r>
-    </w:p>
-    <w:p>
-      <w:pPr>
-        <w:spacing w:before="20" w:after="60"/>
-      </w:pPr>
-      <w:r>
-        <w:rPr>
-          <w:sz w:val="21"/>
-        </w:rPr>
-        <w:t xml:space="preserve">Winner, Seattle Angel Conference VII (2015) — $205,000 investment as Technical Co-Founder of </w:t>
-      </w:r>
-      <w:proofErr w:type="spellStart"/>
-      <w:r>
-        <w:rPr>
-          <w:sz w:val="21"/>
-        </w:rPr>
-        <w:t>Glamhive</w:t>
-      </w:r>
-      <w:proofErr w:type="spellEnd"/>
     </w:p>
     <w:sectPr>
       <w:pgSz w:w="12240" w:h="15840"/>
@@ -2048,16 +1650,16 @@
     <w:pPr>
       <w:keepNext/>
       <w:keepLines/>
-      <w:spacing w:before="480" w:after="0"/>
+      <w:spacing w:before="120" w:after="40"/>
+      <w:jc w:val="center"/>
       <w:outlineLvl w:val="0"/>
     </w:pPr>
     <w:rPr>
-      <w:rFonts w:asciiTheme="majorHAnsi" w:eastAsiaTheme="majorEastAsia" w:hAnsiTheme="majorHAnsi" w:cstheme="majorBidi"/>
       <w:b/>
       <w:bCs/>
-      <w:color w:val="4F81BD" w:themeColor="accent1"/>
-      <w:sz w:val="28"/>
-      <w:szCs w:val="28"/>
+      <w:color w:val="17365D"/>
+      <w:sz w:val="26"/>
+      <w:szCs w:val="26"/>
     </w:rPr>
   </w:style>
   <w:style w:type="paragraph" w:styleId="Heading2">
@@ -2068,20 +1670,18 @@
     <w:uiPriority w:val="9"/>
     <w:unhideWhenUsed/>
     <w:qFormat/>
-    <w:rsid w:val="00FC693F"/>
+    <w:rsid w:val="00EB7382"/>
     <w:pPr>
       <w:keepNext/>
       <w:keepLines/>
-      <w:spacing w:before="200" w:after="0"/>
+      <w:spacing w:before="300" w:after="20"/>
       <w:outlineLvl w:val="1"/>
     </w:pPr>
     <w:rPr>
-      <w:rFonts w:asciiTheme="majorHAnsi" w:eastAsiaTheme="majorEastAsia" w:hAnsiTheme="majorHAnsi" w:cstheme="majorBidi"/>
       <w:b/>
       <w:bCs/>
-      <w:color w:val="4F81BD" w:themeColor="accent1"/>
-      <w:sz w:val="26"/>
-      <w:szCs w:val="26"/>
+      <w:color w:val="00467F"/>
+      <w:sz w:val="24"/>
     </w:rPr>
   </w:style>
   <w:style w:type="paragraph" w:styleId="Heading3">
@@ -2096,14 +1696,15 @@
     <w:pPr>
       <w:keepNext/>
       <w:keepLines/>
-      <w:spacing w:before="200" w:after="0"/>
+      <w:spacing w:before="180" w:after="40"/>
       <w:outlineLvl w:val="2"/>
     </w:pPr>
     <w:rPr>
-      <w:rFonts w:asciiTheme="majorHAnsi" w:eastAsiaTheme="majorEastAsia" w:hAnsiTheme="majorHAnsi" w:cstheme="majorBidi"/>
       <w:b/>
       <w:bCs/>
-      <w:color w:val="4F81BD" w:themeColor="accent1"/>
+      <w:color w:val="000000"/>
+      <w:sz w:val="21"/>
+      <w:szCs w:val="21"/>
     </w:rPr>
   </w:style>
   <w:style w:type="paragraph" w:styleId="Heading4">
@@ -2346,14 +1947,12 @@
     <w:basedOn w:val="DefaultParagraphFont"/>
     <w:link w:val="Heading2"/>
     <w:uiPriority w:val="9"/>
-    <w:rsid w:val="00FC693F"/>
+    <w:rsid w:val="00EB7382"/>
     <w:rPr>
-      <w:rFonts w:asciiTheme="majorHAnsi" w:eastAsiaTheme="majorEastAsia" w:hAnsiTheme="majorHAnsi" w:cstheme="majorBidi"/>
       <w:b/>
       <w:bCs/>
-      <w:color w:val="4F81BD" w:themeColor="accent1"/>
-      <w:sz w:val="26"/>
-      <w:szCs w:val="26"/>
+      <w:color w:val="00467F"/>
+      <w:sz w:val="24"/>
     </w:rPr>
   </w:style>
   <w:style w:type="character" w:customStyle="1" w:styleId="Heading3Char">

</xml_diff>

<commit_message>
Updated default font size and border based HR
</commit_message>
<xml_diff>
--- a/CANONICAL - Chris Tallent Resume - CTO.docx
+++ b/CANONICAL - Chris Tallent Resume - CTO.docx
@@ -46,34 +46,15 @@
     </w:p>
     <w:p>
       <w:pPr>
-        <w:spacing w:before="20" w:after="60"/>
+        <w:pBdr>
+          <w:bottom w:val="single" w:sz="6" w:space="1" w:color="000000"/>
+        </w:pBdr>
+        <w:spacing w:before="120" w:after="220" w:line="14" w:lineRule="exact"/>
         <w:rPr>
           <w:sz w:val="21"/>
           <w:szCs w:val="21"/>
         </w:rPr>
       </w:pPr>
-      <w:r>
-        <w:rPr>
-          <w:sz w:val="21"/>
-          <w:szCs w:val="21"/>
-        </w:rPr>
-        <w:t>────────────────────────────────────────────────────────────</w:t>
-      </w:r>
-      <w:r>
-        <w:rPr>
-          <w:sz w:val="21"/>
-          <w:szCs w:val="21"/>
-        </w:rPr>
-        <w:t>──────────────────────────────</w:t>
-      </w:r>
-      <w:r>
-        <w:rPr>
-          <w:rFonts w:asciiTheme="majorHAnsi" w:hAnsiTheme="majorHAnsi" w:cstheme="majorHAnsi"/>
-          <w:sz w:val="21"/>
-          <w:szCs w:val="21"/>
-        </w:rPr>
-        <w:t>───────</w:t>
-      </w:r>
     </w:p>
     <w:p>
       <w:pPr>
@@ -1254,8 +1235,8 @@
     <w:rPrDefault>
       <w:rPr>
         <w:rFonts w:ascii="Calibri" w:eastAsiaTheme="minorEastAsia" w:hAnsi="Calibri" w:cs="Calibri"/>
-        <w:sz w:val="22"/>
-        <w:szCs w:val="22"/>
+        <w:sz w:val="21"/>
+        <w:szCs w:val="21"/>
         <w:lang w:val="en-US" w:eastAsia="en-US" w:bidi="ar-SA"/>
       </w:rPr>
     </w:rPrDefault>
@@ -1682,6 +1663,7 @@
       <w:bCs/>
       <w:color w:val="00467F"/>
       <w:sz w:val="24"/>
+      <w:szCs w:val="24"/>
     </w:rPr>
   </w:style>
   <w:style w:type="paragraph" w:styleId="Heading3">
@@ -1938,8 +1920,8 @@
       <w:b/>
       <w:bCs/>
       <w:color w:val="4F81BD" w:themeColor="accent1"/>
-      <w:sz w:val="28"/>
-      <w:szCs w:val="28"/>
+      <w:sz w:val="26"/>
+      <w:szCs w:val="26"/>
     </w:rPr>
   </w:style>
   <w:style w:type="character" w:customStyle="1" w:styleId="Heading2Char">
@@ -1953,6 +1935,7 @@
       <w:bCs/>
       <w:color w:val="00467F"/>
       <w:sz w:val="24"/>
+      <w:szCs w:val="24"/>
     </w:rPr>
   </w:style>
   <w:style w:type="character" w:customStyle="1" w:styleId="Heading3Char">
@@ -1966,6 +1949,8 @@
       <w:b/>
       <w:bCs/>
       <w:color w:val="4F81BD" w:themeColor="accent1"/>
+      <w:sz w:val="21"/>
+      <w:szCs w:val="21"/>
     </w:rPr>
   </w:style>
   <w:style w:type="paragraph" w:styleId="Title">

</xml_diff>